<commit_message>
Initial commit without model file
</commit_message>
<xml_diff>
--- a/Kunskapstest_2_My_Tistelberg.docx
+++ b/Kunskapstest_2_My_Tistelberg.docx
@@ -13,6 +13,227 @@
         <w:rPr>
           <w:lang w:val="sv-SE"/>
         </w:rPr>
+        <w:t>Kunskapstest 2 – Självutvärderingen</w:t>
+      </w:r>
+    </w:p>
+    <w:p>
+      <w:pPr>
+        <w:rPr>
+          <w:b/>
+          <w:bCs/>
+          <w:lang w:val="sv-SE"/>
+        </w:rPr>
+      </w:pPr>
+      <w:r>
+        <w:rPr>
+          <w:b/>
+          <w:bCs/>
+          <w:lang w:val="sv-SE"/>
+        </w:rPr>
+        <w:t xml:space="preserve">1. Har något varit utmanande i kursen/kunskapskontrollerna? Om ja, hur har du hanterat det? </w:t>
+      </w:r>
+    </w:p>
+    <w:p>
+      <w:pPr>
+        <w:rPr>
+          <w:lang w:val="sv-SE"/>
+        </w:rPr>
+      </w:pPr>
+      <w:r>
+        <w:rPr>
+          <w:lang w:val="sv-SE"/>
+        </w:rPr>
+        <w:t xml:space="preserve">Denna kurs har varit intensiv men </w:t>
+      </w:r>
+      <w:r>
+        <w:rPr>
+          <w:lang w:val="sv-SE"/>
+        </w:rPr>
+        <w:t xml:space="preserve">om </w:t>
+      </w:r>
+      <w:r>
+        <w:rPr>
+          <w:lang w:val="sv-SE"/>
+        </w:rPr>
+        <w:t>man följde schemat</w:t>
+      </w:r>
+      <w:r>
+        <w:rPr>
+          <w:lang w:val="sv-SE"/>
+        </w:rPr>
+        <w:t xml:space="preserve"> med uppgifter</w:t>
+      </w:r>
+      <w:r>
+        <w:rPr>
+          <w:lang w:val="sv-SE"/>
+        </w:rPr>
+        <w:t xml:space="preserve"> som var upplagt så tyckte jag det gick bra att hänga med. Såg bara till att lägga ner den tiden som behövdes annars tycker jag inte den har varit så utmanande. </w:t>
+      </w:r>
+    </w:p>
+    <w:p>
+      <w:pPr>
+        <w:rPr>
+          <w:b/>
+          <w:bCs/>
+          <w:lang w:val="sv-SE"/>
+        </w:rPr>
+      </w:pPr>
+      <w:r>
+        <w:rPr>
+          <w:b/>
+          <w:bCs/>
+          <w:lang w:val="sv-SE"/>
+        </w:rPr>
+        <w:t xml:space="preserve">2. Vilket betyg anser du att du ska ha och varför? </w:t>
+      </w:r>
+    </w:p>
+    <w:p>
+      <w:pPr>
+        <w:rPr>
+          <w:lang w:val="sv-SE"/>
+        </w:rPr>
+      </w:pPr>
+      <w:r>
+        <w:rPr>
+          <w:lang w:val="sv-SE"/>
+        </w:rPr>
+        <w:t xml:space="preserve">Jag anser att jag </w:t>
+      </w:r>
+      <w:r>
+        <w:rPr>
+          <w:lang w:val="sv-SE"/>
+        </w:rPr>
+        <w:t>ska få betyget VG då jag har nått kursens lärande resultat samt fördjupat mig i</w:t>
+      </w:r>
+      <w:r>
+        <w:rPr>
+          <w:lang w:val="sv-SE"/>
+        </w:rPr>
+        <w:t xml:space="preserve"> programmering,</w:t>
+      </w:r>
+      <w:r>
+        <w:rPr>
+          <w:lang w:val="sv-SE"/>
+        </w:rPr>
+        <w:t xml:space="preserve"> modellering</w:t>
+      </w:r>
+      <w:r>
+        <w:rPr>
+          <w:lang w:val="sv-SE"/>
+        </w:rPr>
+        <w:t xml:space="preserve"> och </w:t>
+      </w:r>
+      <w:proofErr w:type="spellStart"/>
+      <w:r>
+        <w:rPr>
+          <w:lang w:val="sv-SE"/>
+        </w:rPr>
+        <w:t>preprocessing</w:t>
+      </w:r>
+      <w:proofErr w:type="spellEnd"/>
+      <w:r>
+        <w:rPr>
+          <w:lang w:val="sv-SE"/>
+        </w:rPr>
+        <w:t xml:space="preserve"> av inkommande data</w:t>
+      </w:r>
+      <w:r>
+        <w:rPr>
+          <w:lang w:val="sv-SE"/>
+        </w:rPr>
+        <w:t xml:space="preserve"> </w:t>
+      </w:r>
+      <w:r>
+        <w:rPr>
+          <w:lang w:val="sv-SE"/>
+        </w:rPr>
+        <w:t>samt</w:t>
+      </w:r>
+      <w:r>
+        <w:rPr>
+          <w:lang w:val="sv-SE"/>
+        </w:rPr>
+        <w:t xml:space="preserve"> utvecklat e</w:t>
+      </w:r>
+      <w:r>
+        <w:rPr>
+          <w:lang w:val="sv-SE"/>
+        </w:rPr>
+        <w:t>tt</w:t>
+      </w:r>
+      <w:r>
+        <w:rPr>
+          <w:lang w:val="sv-SE"/>
+        </w:rPr>
+        <w:t xml:space="preserve"> BI-</w:t>
+      </w:r>
+      <w:r>
+        <w:rPr>
+          <w:lang w:val="sv-SE"/>
+        </w:rPr>
+        <w:t xml:space="preserve">relaterat system som använder min modell. </w:t>
+      </w:r>
+    </w:p>
+    <w:p>
+      <w:pPr>
+        <w:rPr>
+          <w:b/>
+          <w:bCs/>
+          <w:lang w:val="sv-SE"/>
+        </w:rPr>
+      </w:pPr>
+      <w:r>
+        <w:rPr>
+          <w:b/>
+          <w:bCs/>
+          <w:lang w:val="sv-SE"/>
+        </w:rPr>
+        <w:t>3. Något du vill lyfta fram till Terese?</w:t>
+      </w:r>
+    </w:p>
+    <w:p>
+      <w:pPr>
+        <w:rPr>
+          <w:lang w:val="sv-SE"/>
+        </w:rPr>
+      </w:pPr>
+      <w:r>
+        <w:rPr>
+          <w:lang w:val="sv-SE"/>
+        </w:rPr>
+        <w:t>Jag tycker detta har varit en mycket bra kurs och jag tycker verkligen att du är en bra pedagogisk lärare och jag gillar hur du har lagt upp kursen med alla uppgifter under veckorna det har hjälpt mig!</w:t>
+      </w:r>
+    </w:p>
+    <w:p>
+      <w:pPr>
+        <w:rPr>
+          <w:rFonts w:asciiTheme="majorHAnsi" w:eastAsiaTheme="majorEastAsia" w:hAnsiTheme="majorHAnsi" w:cstheme="majorBidi"/>
+          <w:spacing w:val="-10"/>
+          <w:kern w:val="28"/>
+          <w:sz w:val="56"/>
+          <w:szCs w:val="56"/>
+          <w:lang w:val="sv-SE"/>
+        </w:rPr>
+      </w:pPr>
+      <w:r>
+        <w:rPr>
+          <w:lang w:val="sv-SE"/>
+        </w:rPr>
+        <w:br w:type="page"/>
+      </w:r>
+    </w:p>
+    <w:p>
+      <w:pPr>
+        <w:pStyle w:val="Rubrik"/>
+        <w:rPr>
+          <w:lang w:val="sv-SE"/>
+        </w:rPr>
+      </w:pPr>
+      <w:r>
+        <w:rPr>
+          <w:lang w:val="sv-SE"/>
+        </w:rPr>
+        <w:lastRenderedPageBreak/>
         <w:t>Kunskapstest 2 – Frågedelen</w:t>
       </w:r>
     </w:p>
@@ -535,25 +756,7 @@
           <w:szCs w:val="22"/>
           <w:lang w:val="sv-SE"/>
         </w:rPr>
-        <w:t xml:space="preserve"> som då är definierade i denna klassen så bara om objektet är denna klassen kan den använda dessa funktioner. Så för att använda </w:t>
-      </w:r>
-      <w:proofErr w:type="gramStart"/>
-      <w:r>
-        <w:rPr>
-          <w:sz w:val="22"/>
-          <w:szCs w:val="22"/>
-          <w:lang w:val="sv-SE"/>
-        </w:rPr>
-        <w:t>denna klassen</w:t>
-      </w:r>
-      <w:proofErr w:type="gramEnd"/>
-      <w:r>
-        <w:rPr>
-          <w:sz w:val="22"/>
-          <w:szCs w:val="22"/>
-          <w:lang w:val="sv-SE"/>
-        </w:rPr>
-        <w:t xml:space="preserve"> behöver vi ett objekt </w:t>
+        <w:t xml:space="preserve"> som då är definierade i denna klassen så bara om objektet är denna klassen kan den använda dessa funktioner. Så för att använda denna klass behöver vi ett objekt </w:t>
       </w:r>
       <w:r>
         <w:rPr>
@@ -628,7 +831,47 @@
           <w:szCs w:val="22"/>
           <w:lang w:val="sv-SE"/>
         </w:rPr>
-        <w:t xml:space="preserve"> för att skriva ut samma kod om och om igen så kan man göra en funktion som man sedan kallar på detta är ett sätt att få mindre antal rader kod och det ökar också läsbarheten av koden sedan gör det också om någon parameter behöver ändras så behöver du bara ändra den på ett ställe i koden och inte flera. </w:t>
+        <w:t xml:space="preserve"> för att skriva ut samma kod om och om igen så kan man göra en funktion som man sedan kallar på detta är ett sätt att få mindre antal rader kod </w:t>
+      </w:r>
+      <w:r>
+        <w:rPr>
+          <w:sz w:val="22"/>
+          <w:szCs w:val="22"/>
+          <w:lang w:val="sv-SE"/>
+        </w:rPr>
+        <w:t xml:space="preserve">vilket ökar </w:t>
+      </w:r>
+      <w:r>
+        <w:rPr>
+          <w:sz w:val="22"/>
+          <w:szCs w:val="22"/>
+          <w:lang w:val="sv-SE"/>
+        </w:rPr>
+        <w:t>läsbarheten</w:t>
+      </w:r>
+      <w:r>
+        <w:rPr>
+          <w:sz w:val="22"/>
+          <w:szCs w:val="22"/>
+          <w:lang w:val="sv-SE"/>
+        </w:rPr>
+        <w:t>.</w:t>
+      </w:r>
+      <w:r>
+        <w:rPr>
+          <w:sz w:val="22"/>
+          <w:szCs w:val="22"/>
+          <w:lang w:val="sv-SE"/>
+        </w:rPr>
+        <w:t xml:space="preserve"> </w:t>
+      </w:r>
+      <w:r>
+        <w:rPr>
+          <w:sz w:val="22"/>
+          <w:szCs w:val="22"/>
+          <w:lang w:val="sv-SE"/>
+        </w:rPr>
+        <w:t>Något mer positivt är om man behöva ändra något så ändra man bara på en plats.</w:t>
       </w:r>
       <w:r>
         <w:rPr>
@@ -679,7 +922,7 @@
           <w:szCs w:val="22"/>
           <w:lang w:val="sv-SE"/>
         </w:rPr>
-        <w:t xml:space="preserve"> gör ett pip-ljud. Medan en funktion som returnerar något skickar med ett värde tillbaka som man senare kan använda i tex uträkningar eller addera till en lista. Om man skulle försöka göra det med en funktion som inte returnerar något så får man </w:t>
+        <w:t xml:space="preserve"> gör ett pip-ljud. Medan en funktion som returnerar något skickar med ett värde tillbaka som man senare kan använda i tex uträkningar. Om man skulle försöka göra det med en funktion som inte returnerar något så får man </w:t>
       </w:r>
       <w:proofErr w:type="spellStart"/>
       <w:r>
@@ -759,7 +1002,25 @@
           <w:szCs w:val="22"/>
           <w:lang w:val="sv-SE"/>
         </w:rPr>
-        <w:t>X</w:t>
+        <w:t xml:space="preserve">Skillnaden mellan R och Python är att Python är mer universal och man kan använda till många olika saker </w:t>
+      </w:r>
+      <w:proofErr w:type="gramStart"/>
+      <w:r>
+        <w:rPr>
+          <w:sz w:val="22"/>
+          <w:szCs w:val="22"/>
+          <w:lang w:val="sv-SE"/>
+        </w:rPr>
+        <w:t>medans</w:t>
+      </w:r>
+      <w:proofErr w:type="gramEnd"/>
+      <w:r>
+        <w:rPr>
+          <w:sz w:val="22"/>
+          <w:szCs w:val="22"/>
+          <w:lang w:val="sv-SE"/>
+        </w:rPr>
+        <w:t xml:space="preserve"> R är begränsat och används till statistik, dataanalys och visualiseringar. </w:t>
       </w:r>
     </w:p>
     <w:p>
@@ -996,9 +1257,1366 @@
           <w:szCs w:val="22"/>
           <w:lang w:val="sv-SE"/>
         </w:rPr>
-        <w:t>Regressionproblem</w:t>
-      </w:r>
-      <w:proofErr w:type="spellEnd"/>
+        <w:t>Regressionproble</w:t>
+      </w:r>
+      <w:r>
+        <w:rPr>
+          <w:sz w:val="22"/>
+          <w:szCs w:val="22"/>
+          <w:lang w:val="sv-SE"/>
+        </w:rPr>
+        <w:t>m</w:t>
+      </w:r>
+      <w:proofErr w:type="spellEnd"/>
+      <w:r>
+        <w:rPr>
+          <w:sz w:val="22"/>
+          <w:szCs w:val="22"/>
+          <w:lang w:val="sv-SE"/>
+        </w:rPr>
+        <w:t xml:space="preserve"> är att prediktera en kontinuerlig beroende variabel med hjälp av oberoende variabler. Som exempel priset på en bil med avseende på bilens ålder, märke </w:t>
+      </w:r>
+      <w:proofErr w:type="gramStart"/>
+      <w:r>
+        <w:rPr>
+          <w:sz w:val="22"/>
+          <w:szCs w:val="22"/>
+          <w:lang w:val="sv-SE"/>
+        </w:rPr>
+        <w:t>etc.</w:t>
+      </w:r>
+      <w:proofErr w:type="gramEnd"/>
+    </w:p>
+    <w:p>
+      <w:pPr>
+        <w:pStyle w:val="Liststycke"/>
+        <w:numPr>
+          <w:ilvl w:val="0"/>
+          <w:numId w:val="1"/>
+        </w:numPr>
+        <w:rPr>
+          <w:sz w:val="22"/>
+          <w:szCs w:val="22"/>
+          <w:lang w:val="sv-SE"/>
+        </w:rPr>
+      </w:pPr>
+      <w:r>
+        <w:rPr>
+          <w:sz w:val="22"/>
+          <w:szCs w:val="22"/>
+          <w:lang w:val="sv-SE"/>
+        </w:rPr>
+        <w:t xml:space="preserve">RMSE som betyder </w:t>
+      </w:r>
+      <w:proofErr w:type="spellStart"/>
+      <w:r>
+        <w:rPr>
+          <w:sz w:val="22"/>
+          <w:szCs w:val="22"/>
+          <w:lang w:val="sv-SE"/>
+        </w:rPr>
+        <w:t>Root</w:t>
+      </w:r>
+      <w:proofErr w:type="spellEnd"/>
+      <w:r>
+        <w:rPr>
+          <w:sz w:val="22"/>
+          <w:szCs w:val="22"/>
+          <w:lang w:val="sv-SE"/>
+        </w:rPr>
+        <w:t xml:space="preserve"> </w:t>
+      </w:r>
+      <w:proofErr w:type="spellStart"/>
+      <w:r>
+        <w:rPr>
+          <w:sz w:val="22"/>
+          <w:szCs w:val="22"/>
+          <w:lang w:val="sv-SE"/>
+        </w:rPr>
+        <w:t>Mean</w:t>
+      </w:r>
+      <w:proofErr w:type="spellEnd"/>
+      <w:r>
+        <w:rPr>
+          <w:sz w:val="22"/>
+          <w:szCs w:val="22"/>
+          <w:lang w:val="sv-SE"/>
+        </w:rPr>
+        <w:t xml:space="preserve"> </w:t>
+      </w:r>
+      <w:proofErr w:type="spellStart"/>
+      <w:r>
+        <w:rPr>
+          <w:sz w:val="22"/>
+          <w:szCs w:val="22"/>
+          <w:lang w:val="sv-SE"/>
+        </w:rPr>
+        <w:t>Squared</w:t>
+      </w:r>
+      <w:proofErr w:type="spellEnd"/>
+      <w:r>
+        <w:rPr>
+          <w:sz w:val="22"/>
+          <w:szCs w:val="22"/>
+          <w:lang w:val="sv-SE"/>
+        </w:rPr>
+        <w:t xml:space="preserve"> </w:t>
+      </w:r>
+      <w:proofErr w:type="spellStart"/>
+      <w:r>
+        <w:rPr>
+          <w:sz w:val="22"/>
+          <w:szCs w:val="22"/>
+          <w:lang w:val="sv-SE"/>
+        </w:rPr>
+        <w:t>Error</w:t>
+      </w:r>
+      <w:proofErr w:type="spellEnd"/>
+      <w:r>
+        <w:rPr>
+          <w:sz w:val="22"/>
+          <w:szCs w:val="22"/>
+          <w:lang w:val="sv-SE"/>
+        </w:rPr>
+        <w:t xml:space="preserve"> </w:t>
+      </w:r>
+      <w:r>
+        <w:rPr>
+          <w:sz w:val="22"/>
+          <w:szCs w:val="22"/>
+          <w:lang w:val="sv-SE"/>
+        </w:rPr>
+        <w:t xml:space="preserve">är ett utvärderingsmått för </w:t>
+      </w:r>
+      <w:proofErr w:type="spellStart"/>
+      <w:r>
+        <w:rPr>
+          <w:sz w:val="22"/>
+          <w:szCs w:val="22"/>
+          <w:lang w:val="sv-SE"/>
+        </w:rPr>
+        <w:t>regressionmodeller</w:t>
+      </w:r>
+      <w:proofErr w:type="spellEnd"/>
+      <w:r>
+        <w:rPr>
+          <w:sz w:val="22"/>
+          <w:szCs w:val="22"/>
+          <w:lang w:val="sv-SE"/>
+        </w:rPr>
+        <w:t xml:space="preserve"> och det </w:t>
+      </w:r>
+      <w:r>
+        <w:rPr>
+          <w:sz w:val="22"/>
+          <w:szCs w:val="22"/>
+          <w:lang w:val="sv-SE"/>
+        </w:rPr>
+        <w:t>beskriv</w:t>
+      </w:r>
+      <w:r>
+        <w:rPr>
+          <w:sz w:val="22"/>
+          <w:szCs w:val="22"/>
+          <w:lang w:val="sv-SE"/>
+        </w:rPr>
+        <w:t xml:space="preserve">er hur fel prediktionerna blev mot det verkliga värdet och på så sätt kan vi se hur bra </w:t>
+      </w:r>
+      <w:proofErr w:type="gramStart"/>
+      <w:r>
+        <w:rPr>
+          <w:sz w:val="22"/>
+          <w:szCs w:val="22"/>
+          <w:lang w:val="sv-SE"/>
+        </w:rPr>
+        <w:t>våran</w:t>
+      </w:r>
+      <w:proofErr w:type="gramEnd"/>
+      <w:r>
+        <w:rPr>
+          <w:sz w:val="22"/>
+          <w:szCs w:val="22"/>
+          <w:lang w:val="sv-SE"/>
+        </w:rPr>
+        <w:t xml:space="preserve"> modell är på att prediktera. </w:t>
+      </w:r>
+    </w:p>
+    <w:p>
+      <w:pPr>
+        <w:pStyle w:val="Liststycke"/>
+        <w:numPr>
+          <w:ilvl w:val="0"/>
+          <w:numId w:val="1"/>
+        </w:numPr>
+        <w:rPr>
+          <w:sz w:val="22"/>
+          <w:szCs w:val="22"/>
+          <w:lang w:val="sv-SE"/>
+        </w:rPr>
+      </w:pPr>
+      <w:r>
+        <w:rPr>
+          <w:sz w:val="22"/>
+          <w:szCs w:val="22"/>
+          <w:lang w:val="sv-SE"/>
+        </w:rPr>
+        <w:t xml:space="preserve">Ett klassificeringsproblem handlar om att prediktera vilken klass en kategorisk data har av en eller flera klasser. Några modeller som används inom detta är </w:t>
+      </w:r>
+      <w:proofErr w:type="spellStart"/>
+      <w:r>
+        <w:rPr>
+          <w:sz w:val="22"/>
+          <w:szCs w:val="22"/>
+          <w:lang w:val="sv-SE"/>
+        </w:rPr>
+        <w:t>LogisticRegression</w:t>
+      </w:r>
+      <w:proofErr w:type="spellEnd"/>
+      <w:r>
+        <w:rPr>
+          <w:sz w:val="22"/>
+          <w:szCs w:val="22"/>
+          <w:lang w:val="sv-SE"/>
+        </w:rPr>
+        <w:t xml:space="preserve">, SVC eller trädmodeller så som </w:t>
+      </w:r>
+      <w:proofErr w:type="spellStart"/>
+      <w:r>
+        <w:rPr>
+          <w:sz w:val="22"/>
+          <w:szCs w:val="22"/>
+          <w:lang w:val="sv-SE"/>
+        </w:rPr>
+        <w:t>RandomForest</w:t>
+      </w:r>
+      <w:proofErr w:type="spellEnd"/>
+      <w:r>
+        <w:rPr>
+          <w:sz w:val="22"/>
+          <w:szCs w:val="22"/>
+          <w:lang w:val="sv-SE"/>
+        </w:rPr>
+        <w:t xml:space="preserve"> eller </w:t>
+      </w:r>
+      <w:proofErr w:type="spellStart"/>
+      <w:r>
+        <w:rPr>
+          <w:sz w:val="22"/>
+          <w:szCs w:val="22"/>
+          <w:lang w:val="sv-SE"/>
+        </w:rPr>
+        <w:t>ExtraTree</w:t>
+      </w:r>
+      <w:proofErr w:type="spellEnd"/>
+      <w:r>
+        <w:rPr>
+          <w:sz w:val="22"/>
+          <w:szCs w:val="22"/>
+          <w:lang w:val="sv-SE"/>
+        </w:rPr>
+        <w:t xml:space="preserve">. </w:t>
+      </w:r>
+      <w:r>
+        <w:rPr>
+          <w:sz w:val="22"/>
+          <w:szCs w:val="22"/>
+          <w:lang w:val="sv-SE"/>
+        </w:rPr>
+        <w:t>Hur det skulle kunna användas skulle kunna vara</w:t>
+      </w:r>
+      <w:r>
+        <w:rPr>
+          <w:sz w:val="22"/>
+          <w:szCs w:val="22"/>
+          <w:lang w:val="sv-SE"/>
+        </w:rPr>
+        <w:t xml:space="preserve"> tex om en person är man eller kvinna utifrån att ha analyserat deras data eller </w:t>
+      </w:r>
+      <w:r>
+        <w:rPr>
+          <w:sz w:val="22"/>
+          <w:szCs w:val="22"/>
+          <w:lang w:val="sv-SE"/>
+        </w:rPr>
+        <w:t xml:space="preserve">anomalidetektion </w:t>
+      </w:r>
+      <w:r>
+        <w:rPr>
+          <w:sz w:val="22"/>
+          <w:szCs w:val="22"/>
+          <w:lang w:val="sv-SE"/>
+        </w:rPr>
+        <w:t>i tillverkningsindustrin</w:t>
+      </w:r>
+      <w:r>
+        <w:rPr>
+          <w:sz w:val="22"/>
+          <w:szCs w:val="22"/>
+          <w:lang w:val="sv-SE"/>
+        </w:rPr>
+        <w:t xml:space="preserve"> där kameror ska identifiera produkter som inte håller standarden.</w:t>
+      </w:r>
+    </w:p>
+    <w:p>
+      <w:pPr>
+        <w:pStyle w:val="Liststycke"/>
+        <w:numPr>
+          <w:ilvl w:val="0"/>
+          <w:numId w:val="1"/>
+        </w:numPr>
+        <w:rPr>
+          <w:sz w:val="22"/>
+          <w:szCs w:val="22"/>
+          <w:lang w:val="sv-SE"/>
+        </w:rPr>
+      </w:pPr>
+      <w:r>
+        <w:rPr>
+          <w:sz w:val="22"/>
+          <w:szCs w:val="22"/>
+          <w:lang w:val="sv-SE"/>
+        </w:rPr>
+        <w:t xml:space="preserve">En </w:t>
+      </w:r>
+      <w:proofErr w:type="spellStart"/>
+      <w:r>
+        <w:rPr>
+          <w:sz w:val="22"/>
+          <w:szCs w:val="22"/>
+          <w:lang w:val="sv-SE"/>
+        </w:rPr>
+        <w:t>confusion</w:t>
+      </w:r>
+      <w:proofErr w:type="spellEnd"/>
+      <w:r>
+        <w:rPr>
+          <w:sz w:val="22"/>
+          <w:szCs w:val="22"/>
+          <w:lang w:val="sv-SE"/>
+        </w:rPr>
+        <w:t xml:space="preserve"> Matrix är ett utvärderingssätt för klassificeringsmodeller, då skrivs alla modellens gissningar ut i en tabell för respektive gissning mot det sanna värdet.</w:t>
+      </w:r>
+      <w:r>
+        <w:rPr>
+          <w:sz w:val="22"/>
+          <w:szCs w:val="22"/>
+          <w:lang w:val="sv-SE"/>
+        </w:rPr>
+        <w:t xml:space="preserve"> På så sätt kan man se hur modellen gissar och man kan upptäcka systematiska fel modellen gör tex om den gissar alltid fel på en klass men inte på andra så kan man kontrollera hur </w:t>
+      </w:r>
+      <w:proofErr w:type="spellStart"/>
+      <w:r>
+        <w:rPr>
+          <w:sz w:val="22"/>
+          <w:szCs w:val="22"/>
+          <w:lang w:val="sv-SE"/>
+        </w:rPr>
+        <w:t>träningsdatan</w:t>
+      </w:r>
+      <w:proofErr w:type="spellEnd"/>
+      <w:r>
+        <w:rPr>
+          <w:sz w:val="22"/>
+          <w:szCs w:val="22"/>
+          <w:lang w:val="sv-SE"/>
+        </w:rPr>
+        <w:t xml:space="preserve"> egentligen ser ut för den klassen och eventuellt komplettera den för att se om modellen prestera bättre med mer eller något annorlunda data. </w:t>
+      </w:r>
+    </w:p>
+    <w:p>
+      <w:pPr>
+        <w:pStyle w:val="Liststycke"/>
+        <w:numPr>
+          <w:ilvl w:val="0"/>
+          <w:numId w:val="1"/>
+        </w:numPr>
+        <w:rPr>
+          <w:sz w:val="22"/>
+          <w:szCs w:val="22"/>
+          <w:lang w:val="sv-SE"/>
+        </w:rPr>
+      </w:pPr>
+      <w:r>
+        <w:rPr>
+          <w:sz w:val="22"/>
+          <w:szCs w:val="22"/>
+          <w:lang w:val="sv-SE"/>
+        </w:rPr>
+        <w:lastRenderedPageBreak/>
+        <w:t>K-</w:t>
+      </w:r>
+      <w:proofErr w:type="spellStart"/>
+      <w:r>
+        <w:rPr>
+          <w:sz w:val="22"/>
+          <w:szCs w:val="22"/>
+          <w:lang w:val="sv-SE"/>
+        </w:rPr>
+        <w:t>means</w:t>
+      </w:r>
+      <w:proofErr w:type="spellEnd"/>
+      <w:r>
+        <w:rPr>
+          <w:sz w:val="22"/>
+          <w:szCs w:val="22"/>
+          <w:lang w:val="sv-SE"/>
+        </w:rPr>
+        <w:t xml:space="preserve"> är den vanligaste modellen för </w:t>
+      </w:r>
+      <w:proofErr w:type="spellStart"/>
+      <w:r>
+        <w:rPr>
+          <w:sz w:val="22"/>
+          <w:szCs w:val="22"/>
+          <w:lang w:val="sv-SE"/>
+        </w:rPr>
+        <w:t>klustring</w:t>
+      </w:r>
+      <w:proofErr w:type="spellEnd"/>
+      <w:r>
+        <w:rPr>
+          <w:sz w:val="22"/>
+          <w:szCs w:val="22"/>
+          <w:lang w:val="sv-SE"/>
+        </w:rPr>
+        <w:t>. Den använder sig utav områden (kluster) med en mittpunkt (</w:t>
+      </w:r>
+      <w:proofErr w:type="spellStart"/>
+      <w:r>
+        <w:rPr>
+          <w:sz w:val="22"/>
+          <w:szCs w:val="22"/>
+          <w:lang w:val="sv-SE"/>
+        </w:rPr>
+        <w:t>centriod</w:t>
+      </w:r>
+      <w:proofErr w:type="spellEnd"/>
+      <w:r>
+        <w:rPr>
+          <w:sz w:val="22"/>
+          <w:szCs w:val="22"/>
+          <w:lang w:val="sv-SE"/>
+        </w:rPr>
+        <w:t xml:space="preserve">) och när </w:t>
+      </w:r>
+      <w:proofErr w:type="gramStart"/>
+      <w:r>
+        <w:rPr>
+          <w:sz w:val="22"/>
+          <w:szCs w:val="22"/>
+          <w:lang w:val="sv-SE"/>
+        </w:rPr>
+        <w:t>ny data</w:t>
+      </w:r>
+      <w:proofErr w:type="gramEnd"/>
+      <w:r>
+        <w:rPr>
+          <w:sz w:val="22"/>
+          <w:szCs w:val="22"/>
+          <w:lang w:val="sv-SE"/>
+        </w:rPr>
+        <w:t xml:space="preserve"> introduceras så kommer den hamna i det område vars </w:t>
+      </w:r>
+      <w:proofErr w:type="spellStart"/>
+      <w:r>
+        <w:rPr>
+          <w:sz w:val="22"/>
+          <w:szCs w:val="22"/>
+          <w:lang w:val="sv-SE"/>
+        </w:rPr>
+        <w:t>centriod</w:t>
+      </w:r>
+      <w:proofErr w:type="spellEnd"/>
+      <w:r>
+        <w:rPr>
+          <w:sz w:val="22"/>
+          <w:szCs w:val="22"/>
+          <w:lang w:val="sv-SE"/>
+        </w:rPr>
+        <w:t xml:space="preserve"> är närmst. Detta kan användas vid tex kundsegmentering för att gruppera kunder med liknande attribut för att tex skicka ut mer relevant reklam till varje kundgrupp.</w:t>
+      </w:r>
+    </w:p>
+    <w:p>
+      <w:pPr>
+        <w:pStyle w:val="Liststycke"/>
+        <w:numPr>
+          <w:ilvl w:val="0"/>
+          <w:numId w:val="1"/>
+        </w:numPr>
+        <w:rPr>
+          <w:sz w:val="22"/>
+          <w:szCs w:val="22"/>
+          <w:lang w:val="sv-SE"/>
+        </w:rPr>
+      </w:pPr>
+      <w:r>
+        <w:rPr>
+          <w:sz w:val="22"/>
+          <w:szCs w:val="22"/>
+          <w:lang w:val="sv-SE"/>
+        </w:rPr>
+        <w:t xml:space="preserve">Eftersom modeller inte kan hantera </w:t>
+      </w:r>
+      <w:proofErr w:type="gramStart"/>
+      <w:r>
+        <w:rPr>
+          <w:sz w:val="22"/>
+          <w:szCs w:val="22"/>
+          <w:lang w:val="sv-SE"/>
+        </w:rPr>
+        <w:t>kategorisk data</w:t>
+      </w:r>
+      <w:proofErr w:type="gramEnd"/>
+      <w:r>
+        <w:rPr>
+          <w:sz w:val="22"/>
+          <w:szCs w:val="22"/>
+          <w:lang w:val="sv-SE"/>
+        </w:rPr>
+        <w:t xml:space="preserve"> som den är så behöver man koda om den till </w:t>
+      </w:r>
+      <w:proofErr w:type="gramStart"/>
+      <w:r>
+        <w:rPr>
+          <w:sz w:val="22"/>
+          <w:szCs w:val="22"/>
+          <w:lang w:val="sv-SE"/>
+        </w:rPr>
+        <w:t>numerisk data</w:t>
+      </w:r>
+      <w:proofErr w:type="gramEnd"/>
+      <w:r>
+        <w:rPr>
+          <w:sz w:val="22"/>
+          <w:szCs w:val="22"/>
+          <w:lang w:val="sv-SE"/>
+        </w:rPr>
+        <w:t xml:space="preserve"> och då finns det olika sätt att göra det på.</w:t>
+      </w:r>
+    </w:p>
+    <w:p>
+      <w:pPr>
+        <w:pStyle w:val="Liststycke"/>
+        <w:numPr>
+          <w:ilvl w:val="1"/>
+          <w:numId w:val="1"/>
+        </w:numPr>
+        <w:rPr>
+          <w:sz w:val="22"/>
+          <w:szCs w:val="22"/>
+          <w:lang w:val="sv-SE"/>
+        </w:rPr>
+      </w:pPr>
+      <w:proofErr w:type="spellStart"/>
+      <w:r>
+        <w:rPr>
+          <w:sz w:val="22"/>
+          <w:szCs w:val="22"/>
+          <w:lang w:val="sv-SE"/>
+        </w:rPr>
+        <w:t>Ordinal</w:t>
+      </w:r>
+      <w:proofErr w:type="spellEnd"/>
+      <w:r>
+        <w:rPr>
+          <w:sz w:val="22"/>
+          <w:szCs w:val="22"/>
+          <w:lang w:val="sv-SE"/>
+        </w:rPr>
+        <w:t xml:space="preserve"> </w:t>
+      </w:r>
+      <w:proofErr w:type="spellStart"/>
+      <w:r>
+        <w:rPr>
+          <w:sz w:val="22"/>
+          <w:szCs w:val="22"/>
+          <w:lang w:val="sv-SE"/>
+        </w:rPr>
+        <w:t>encoding</w:t>
+      </w:r>
+      <w:proofErr w:type="spellEnd"/>
+      <w:r>
+        <w:rPr>
+          <w:sz w:val="22"/>
+          <w:szCs w:val="22"/>
+          <w:lang w:val="sv-SE"/>
+        </w:rPr>
+        <w:t xml:space="preserve"> används för att omvandla </w:t>
+      </w:r>
+      <w:proofErr w:type="gramStart"/>
+      <w:r>
+        <w:rPr>
+          <w:sz w:val="22"/>
+          <w:szCs w:val="22"/>
+          <w:lang w:val="sv-SE"/>
+        </w:rPr>
+        <w:t>kategorisk data</w:t>
+      </w:r>
+      <w:proofErr w:type="gramEnd"/>
+      <w:r>
+        <w:rPr>
+          <w:sz w:val="22"/>
+          <w:szCs w:val="22"/>
+          <w:lang w:val="sv-SE"/>
+        </w:rPr>
+        <w:t xml:space="preserve"> som har någon form av rangordning till siffror. Tex lönespann: låg -&gt; 1, medel -&gt; 2, hög -&gt;3.</w:t>
+      </w:r>
+    </w:p>
+    <w:p>
+      <w:pPr>
+        <w:pStyle w:val="Liststycke"/>
+        <w:numPr>
+          <w:ilvl w:val="1"/>
+          <w:numId w:val="1"/>
+        </w:numPr>
+        <w:rPr>
+          <w:sz w:val="22"/>
+          <w:szCs w:val="22"/>
+          <w:lang w:val="sv-SE"/>
+        </w:rPr>
+      </w:pPr>
+      <w:proofErr w:type="spellStart"/>
+      <w:r>
+        <w:rPr>
+          <w:sz w:val="22"/>
+          <w:szCs w:val="22"/>
+          <w:lang w:val="sv-SE"/>
+        </w:rPr>
+        <w:t>One</w:t>
+      </w:r>
+      <w:proofErr w:type="spellEnd"/>
+      <w:r>
+        <w:rPr>
+          <w:sz w:val="22"/>
+          <w:szCs w:val="22"/>
+          <w:lang w:val="sv-SE"/>
+        </w:rPr>
+        <w:t xml:space="preserve">-hot </w:t>
+      </w:r>
+      <w:proofErr w:type="spellStart"/>
+      <w:r>
+        <w:rPr>
+          <w:sz w:val="22"/>
+          <w:szCs w:val="22"/>
+          <w:lang w:val="sv-SE"/>
+        </w:rPr>
+        <w:t>encoding</w:t>
+      </w:r>
+      <w:proofErr w:type="spellEnd"/>
+      <w:r>
+        <w:rPr>
+          <w:sz w:val="22"/>
+          <w:szCs w:val="22"/>
+          <w:lang w:val="sv-SE"/>
+        </w:rPr>
+        <w:t xml:space="preserve"> används när man har </w:t>
+      </w:r>
+      <w:proofErr w:type="gramStart"/>
+      <w:r>
+        <w:rPr>
+          <w:sz w:val="22"/>
+          <w:szCs w:val="22"/>
+          <w:lang w:val="sv-SE"/>
+        </w:rPr>
+        <w:t>kategorisk</w:t>
+      </w:r>
+      <w:r>
+        <w:rPr>
+          <w:sz w:val="22"/>
+          <w:szCs w:val="22"/>
+          <w:lang w:val="sv-SE"/>
+        </w:rPr>
+        <w:t xml:space="preserve"> data</w:t>
+      </w:r>
+      <w:proofErr w:type="gramEnd"/>
+      <w:r>
+        <w:rPr>
+          <w:sz w:val="22"/>
+          <w:szCs w:val="22"/>
+          <w:lang w:val="sv-SE"/>
+        </w:rPr>
+        <w:t xml:space="preserve"> som inte har någon rangordning, och då gör man nya kolumner för varje alternativ av den kategoriska </w:t>
+      </w:r>
+      <w:proofErr w:type="spellStart"/>
+      <w:r>
+        <w:rPr>
+          <w:sz w:val="22"/>
+          <w:szCs w:val="22"/>
+          <w:lang w:val="sv-SE"/>
+        </w:rPr>
+        <w:t>datan</w:t>
+      </w:r>
+      <w:proofErr w:type="spellEnd"/>
+      <w:r>
+        <w:rPr>
+          <w:sz w:val="22"/>
+          <w:szCs w:val="22"/>
+          <w:lang w:val="sv-SE"/>
+        </w:rPr>
+        <w:t xml:space="preserve">, och sätter en 1 i den kolumn som stämmer </w:t>
+      </w:r>
+      <w:r>
+        <w:rPr>
+          <w:sz w:val="22"/>
+          <w:szCs w:val="22"/>
+          <w:lang w:val="sv-SE"/>
+        </w:rPr>
+        <w:t>överens</w:t>
+      </w:r>
+      <w:r>
+        <w:rPr>
+          <w:sz w:val="22"/>
+          <w:szCs w:val="22"/>
+          <w:lang w:val="sv-SE"/>
+        </w:rPr>
+        <w:t xml:space="preserve"> med </w:t>
+      </w:r>
+      <w:r>
+        <w:rPr>
+          <w:sz w:val="22"/>
+          <w:szCs w:val="22"/>
+          <w:lang w:val="sv-SE"/>
+        </w:rPr>
+        <w:t xml:space="preserve">den datapunkten och 0 i de resterande kolumnerna, radsumman ska alltid vara 1. Detta kan användas vid tex färger på bilar. </w:t>
+      </w:r>
+    </w:p>
+    <w:p>
+      <w:pPr>
+        <w:pStyle w:val="Liststycke"/>
+        <w:numPr>
+          <w:ilvl w:val="1"/>
+          <w:numId w:val="1"/>
+        </w:numPr>
+        <w:rPr>
+          <w:sz w:val="22"/>
+          <w:szCs w:val="22"/>
+          <w:lang w:val="sv-SE"/>
+        </w:rPr>
+      </w:pPr>
+      <w:r>
+        <w:rPr>
+          <w:sz w:val="22"/>
+          <w:szCs w:val="22"/>
+          <w:lang w:val="sv-SE"/>
+        </w:rPr>
+        <w:t xml:space="preserve">Dummy </w:t>
+      </w:r>
+      <w:proofErr w:type="spellStart"/>
+      <w:r>
+        <w:rPr>
+          <w:sz w:val="22"/>
+          <w:szCs w:val="22"/>
+          <w:lang w:val="sv-SE"/>
+        </w:rPr>
+        <w:t>variable</w:t>
+      </w:r>
+      <w:proofErr w:type="spellEnd"/>
+      <w:r>
+        <w:rPr>
+          <w:sz w:val="22"/>
+          <w:szCs w:val="22"/>
+          <w:lang w:val="sv-SE"/>
+        </w:rPr>
+        <w:t xml:space="preserve"> </w:t>
+      </w:r>
+      <w:proofErr w:type="spellStart"/>
+      <w:r>
+        <w:rPr>
+          <w:sz w:val="22"/>
+          <w:szCs w:val="22"/>
+          <w:lang w:val="sv-SE"/>
+        </w:rPr>
+        <w:t>encoding</w:t>
+      </w:r>
+      <w:proofErr w:type="spellEnd"/>
+      <w:r>
+        <w:rPr>
+          <w:sz w:val="22"/>
+          <w:szCs w:val="22"/>
+          <w:lang w:val="sv-SE"/>
+        </w:rPr>
+        <w:t xml:space="preserve"> är i stort sett samma som </w:t>
+      </w:r>
+      <w:proofErr w:type="spellStart"/>
+      <w:r>
+        <w:rPr>
+          <w:sz w:val="22"/>
+          <w:szCs w:val="22"/>
+          <w:lang w:val="sv-SE"/>
+        </w:rPr>
+        <w:t>one</w:t>
+      </w:r>
+      <w:proofErr w:type="spellEnd"/>
+      <w:r>
+        <w:rPr>
+          <w:sz w:val="22"/>
+          <w:szCs w:val="22"/>
+          <w:lang w:val="sv-SE"/>
+        </w:rPr>
+        <w:t xml:space="preserve">-hot </w:t>
+      </w:r>
+      <w:proofErr w:type="spellStart"/>
+      <w:r>
+        <w:rPr>
+          <w:sz w:val="22"/>
+          <w:szCs w:val="22"/>
+          <w:lang w:val="sv-SE"/>
+        </w:rPr>
+        <w:t>encoding</w:t>
+      </w:r>
+      <w:proofErr w:type="spellEnd"/>
+      <w:r>
+        <w:rPr>
+          <w:sz w:val="22"/>
+          <w:szCs w:val="22"/>
+          <w:lang w:val="sv-SE"/>
+        </w:rPr>
+        <w:t xml:space="preserve"> men </w:t>
+      </w:r>
+      <w:proofErr w:type="gramStart"/>
+      <w:r>
+        <w:rPr>
+          <w:sz w:val="22"/>
+          <w:szCs w:val="22"/>
+          <w:lang w:val="sv-SE"/>
+        </w:rPr>
+        <w:t>istället</w:t>
+      </w:r>
+      <w:proofErr w:type="gramEnd"/>
+      <w:r>
+        <w:rPr>
+          <w:sz w:val="22"/>
+          <w:szCs w:val="22"/>
+          <w:lang w:val="sv-SE"/>
+        </w:rPr>
+        <w:t xml:space="preserve"> för att få en kolumn per alternativ av den kategoriska </w:t>
+      </w:r>
+      <w:proofErr w:type="spellStart"/>
+      <w:r>
+        <w:rPr>
+          <w:sz w:val="22"/>
+          <w:szCs w:val="22"/>
+          <w:lang w:val="sv-SE"/>
+        </w:rPr>
+        <w:t>datan</w:t>
+      </w:r>
+      <w:proofErr w:type="spellEnd"/>
+      <w:r>
+        <w:rPr>
+          <w:sz w:val="22"/>
+          <w:szCs w:val="22"/>
+          <w:lang w:val="sv-SE"/>
+        </w:rPr>
+        <w:t xml:space="preserve"> så får man en kolumn färre. Då kan det vara så att en datapunkt har 0 i alla kolumner men det innebär att den är den kolumnen som inte kom med vilket då modellen förstår.</w:t>
+      </w:r>
+    </w:p>
+    <w:p>
+      <w:pPr>
+        <w:pStyle w:val="Liststycke"/>
+        <w:numPr>
+          <w:ilvl w:val="0"/>
+          <w:numId w:val="1"/>
+        </w:numPr>
+        <w:rPr>
+          <w:sz w:val="22"/>
+          <w:szCs w:val="22"/>
+          <w:lang w:val="sv-SE"/>
+        </w:rPr>
+      </w:pPr>
+      <w:r>
+        <w:rPr>
+          <w:sz w:val="22"/>
+          <w:szCs w:val="22"/>
+          <w:lang w:val="sv-SE"/>
+        </w:rPr>
+        <w:t>Jag skulle säga att Julia har rätt</w:t>
+      </w:r>
+      <w:r>
+        <w:rPr>
+          <w:sz w:val="22"/>
+          <w:szCs w:val="22"/>
+          <w:lang w:val="sv-SE"/>
+        </w:rPr>
+        <w:t xml:space="preserve"> eftersom det är utefter hur vi tolkar </w:t>
+      </w:r>
+      <w:proofErr w:type="spellStart"/>
+      <w:r>
+        <w:rPr>
+          <w:sz w:val="22"/>
+          <w:szCs w:val="22"/>
+          <w:lang w:val="sv-SE"/>
+        </w:rPr>
+        <w:t>datan</w:t>
+      </w:r>
+      <w:proofErr w:type="spellEnd"/>
+      <w:r>
+        <w:rPr>
+          <w:sz w:val="22"/>
+          <w:szCs w:val="22"/>
+          <w:lang w:val="sv-SE"/>
+        </w:rPr>
+        <w:t xml:space="preserve"> om den är nominal eller </w:t>
+      </w:r>
+      <w:proofErr w:type="spellStart"/>
+      <w:r>
+        <w:rPr>
+          <w:sz w:val="22"/>
+          <w:szCs w:val="22"/>
+          <w:lang w:val="sv-SE"/>
+        </w:rPr>
+        <w:t>ordinal</w:t>
+      </w:r>
+      <w:proofErr w:type="spellEnd"/>
+      <w:r>
+        <w:rPr>
+          <w:sz w:val="22"/>
+          <w:szCs w:val="22"/>
+          <w:lang w:val="sv-SE"/>
+        </w:rPr>
+        <w:t>.</w:t>
+      </w:r>
+      <w:r>
+        <w:rPr>
+          <w:sz w:val="22"/>
+          <w:szCs w:val="22"/>
+          <w:lang w:val="sv-SE"/>
+        </w:rPr>
+        <w:t xml:space="preserve"> </w:t>
+      </w:r>
+      <w:r>
+        <w:rPr>
+          <w:sz w:val="22"/>
+          <w:szCs w:val="22"/>
+          <w:lang w:val="sv-SE"/>
+        </w:rPr>
+        <w:t>F</w:t>
+      </w:r>
+      <w:r>
+        <w:rPr>
+          <w:sz w:val="22"/>
+          <w:szCs w:val="22"/>
+          <w:lang w:val="sv-SE"/>
+        </w:rPr>
+        <w:t>ör om det är så att man ser att det är röda tröjor är mer populära än gröna tröjor som i sig är mer populära än blå så finns det ju en rangordning och därav är d</w:t>
+      </w:r>
+      <w:r>
+        <w:rPr>
+          <w:sz w:val="22"/>
+          <w:szCs w:val="22"/>
+          <w:lang w:val="sv-SE"/>
+        </w:rPr>
+        <w:t>en</w:t>
+      </w:r>
+      <w:r>
+        <w:rPr>
+          <w:sz w:val="22"/>
+          <w:szCs w:val="22"/>
+          <w:lang w:val="sv-SE"/>
+        </w:rPr>
+        <w:t xml:space="preserve"> </w:t>
+      </w:r>
+      <w:proofErr w:type="spellStart"/>
+      <w:r>
+        <w:rPr>
+          <w:sz w:val="22"/>
+          <w:szCs w:val="22"/>
+          <w:lang w:val="sv-SE"/>
+        </w:rPr>
+        <w:t>ordinal</w:t>
+      </w:r>
+      <w:proofErr w:type="spellEnd"/>
+      <w:r>
+        <w:rPr>
+          <w:sz w:val="22"/>
+          <w:szCs w:val="22"/>
+          <w:lang w:val="sv-SE"/>
+        </w:rPr>
+        <w:t xml:space="preserve">. </w:t>
+      </w:r>
+    </w:p>
+    <w:p>
+      <w:pPr>
+        <w:pStyle w:val="Liststycke"/>
+        <w:numPr>
+          <w:ilvl w:val="0"/>
+          <w:numId w:val="1"/>
+        </w:numPr>
+        <w:rPr>
+          <w:sz w:val="22"/>
+          <w:szCs w:val="22"/>
+          <w:lang w:val="sv-SE"/>
+        </w:rPr>
+      </w:pPr>
+      <w:r>
+        <w:rPr>
+          <w:sz w:val="22"/>
+          <w:szCs w:val="22"/>
+          <w:lang w:val="sv-SE"/>
+        </w:rPr>
+        <w:t xml:space="preserve">Hyperparametrar berättar hur vi </w:t>
+      </w:r>
+      <w:r>
+        <w:rPr>
+          <w:sz w:val="22"/>
+          <w:szCs w:val="22"/>
+          <w:lang w:val="sv-SE"/>
+        </w:rPr>
+        <w:t xml:space="preserve">lär oss och parametrar är vad vi lär oss. Så skulle säga att hyperparametrarna är inställningen på maskineriet som vi använder för att lära oss </w:t>
+      </w:r>
+      <w:proofErr w:type="gramStart"/>
+      <w:r>
+        <w:rPr>
+          <w:sz w:val="22"/>
+          <w:szCs w:val="22"/>
+          <w:lang w:val="sv-SE"/>
+        </w:rPr>
+        <w:t>medans</w:t>
+      </w:r>
+      <w:proofErr w:type="gramEnd"/>
+      <w:r>
+        <w:rPr>
+          <w:sz w:val="22"/>
+          <w:szCs w:val="22"/>
+          <w:lang w:val="sv-SE"/>
+        </w:rPr>
+        <w:t xml:space="preserve"> parametrarna är de </w:t>
+      </w:r>
+      <w:r>
+        <w:rPr>
+          <w:sz w:val="22"/>
+          <w:szCs w:val="22"/>
+          <w:lang w:val="sv-SE"/>
+        </w:rPr>
+        <w:t xml:space="preserve">regler </w:t>
+      </w:r>
+      <w:r>
+        <w:rPr>
+          <w:sz w:val="22"/>
+          <w:szCs w:val="22"/>
+          <w:lang w:val="sv-SE"/>
+        </w:rPr>
+        <w:t xml:space="preserve">vi lär oss </w:t>
+      </w:r>
+      <w:r>
+        <w:rPr>
+          <w:sz w:val="22"/>
+          <w:szCs w:val="22"/>
+          <w:lang w:val="sv-SE"/>
+        </w:rPr>
+        <w:t>som blir modellen</w:t>
+      </w:r>
+      <w:r>
+        <w:rPr>
+          <w:sz w:val="22"/>
+          <w:szCs w:val="22"/>
+          <w:lang w:val="sv-SE"/>
+        </w:rPr>
+        <w:t xml:space="preserve">. Tex på en hyperparameter är </w:t>
+      </w:r>
+      <w:proofErr w:type="spellStart"/>
+      <w:r>
+        <w:rPr>
+          <w:sz w:val="22"/>
+          <w:szCs w:val="22"/>
+          <w:lang w:val="sv-SE"/>
+        </w:rPr>
+        <w:t>max_depth</w:t>
+      </w:r>
+      <w:proofErr w:type="spellEnd"/>
+      <w:r>
+        <w:rPr>
+          <w:sz w:val="22"/>
+          <w:szCs w:val="22"/>
+          <w:lang w:val="sv-SE"/>
+        </w:rPr>
+        <w:t xml:space="preserve"> i trädmodeller som säger hur långt ner vi får gå när vi lär oss </w:t>
+      </w:r>
+      <w:proofErr w:type="spellStart"/>
+      <w:r>
+        <w:rPr>
+          <w:sz w:val="22"/>
+          <w:szCs w:val="22"/>
+          <w:lang w:val="sv-SE"/>
+        </w:rPr>
+        <w:t>datan</w:t>
+      </w:r>
+      <w:proofErr w:type="spellEnd"/>
+      <w:r>
+        <w:rPr>
+          <w:sz w:val="22"/>
+          <w:szCs w:val="22"/>
+          <w:lang w:val="sv-SE"/>
+        </w:rPr>
+        <w:t xml:space="preserve"> och</w:t>
+      </w:r>
+      <w:r>
+        <w:rPr>
+          <w:sz w:val="22"/>
+          <w:szCs w:val="22"/>
+          <w:lang w:val="sv-SE"/>
+        </w:rPr>
+        <w:t xml:space="preserve"> </w:t>
+      </w:r>
+      <w:r>
+        <w:rPr>
+          <w:sz w:val="22"/>
+          <w:szCs w:val="22"/>
+          <w:lang w:val="sv-SE"/>
+        </w:rPr>
+        <w:t xml:space="preserve">ett exempel på parameter skulle kunna vara de olika tröskelvärdena om man ska gå höger eller vänster i trädmodellen. Eftersom hyperparametrarna är inställningarna inför </w:t>
+      </w:r>
+      <w:proofErr w:type="spellStart"/>
+      <w:r>
+        <w:rPr>
+          <w:sz w:val="22"/>
+          <w:szCs w:val="22"/>
+          <w:lang w:val="sv-SE"/>
+        </w:rPr>
+        <w:t>lärningen</w:t>
+      </w:r>
+      <w:proofErr w:type="spellEnd"/>
+      <w:r>
+        <w:rPr>
+          <w:sz w:val="22"/>
+          <w:szCs w:val="22"/>
+          <w:lang w:val="sv-SE"/>
+        </w:rPr>
+        <w:t xml:space="preserve"> så behöver de optimeras innan man optimerar parametrarna. Så den ena görs utanför modellen och den andra görs i den kan man säga.</w:t>
+      </w:r>
+    </w:p>
+    <w:p>
+      <w:pPr>
+        <w:pStyle w:val="Liststycke"/>
+        <w:numPr>
+          <w:ilvl w:val="0"/>
+          <w:numId w:val="1"/>
+        </w:numPr>
+        <w:rPr>
+          <w:sz w:val="22"/>
+          <w:szCs w:val="22"/>
+          <w:lang w:val="sv-SE"/>
+        </w:rPr>
+      </w:pPr>
+      <w:proofErr w:type="spellStart"/>
+      <w:r>
+        <w:rPr>
+          <w:sz w:val="22"/>
+          <w:szCs w:val="22"/>
+          <w:lang w:val="sv-SE"/>
+        </w:rPr>
+        <w:t>Overfitting</w:t>
+      </w:r>
+      <w:proofErr w:type="spellEnd"/>
+      <w:r>
+        <w:rPr>
+          <w:sz w:val="22"/>
+          <w:szCs w:val="22"/>
+          <w:lang w:val="sv-SE"/>
+        </w:rPr>
+        <w:t xml:space="preserve"> (överanpassad)</w:t>
+      </w:r>
+      <w:r>
+        <w:rPr>
+          <w:sz w:val="22"/>
+          <w:szCs w:val="22"/>
+          <w:lang w:val="sv-SE"/>
+        </w:rPr>
+        <w:t xml:space="preserve"> är när man anpassat modellen för mycket efter sin träningsdata, den blir liksom </w:t>
+      </w:r>
+      <w:proofErr w:type="spellStart"/>
+      <w:r>
+        <w:rPr>
+          <w:sz w:val="22"/>
+          <w:szCs w:val="22"/>
+          <w:lang w:val="sv-SE"/>
+        </w:rPr>
+        <w:t>skräddsydd</w:t>
+      </w:r>
+      <w:proofErr w:type="spellEnd"/>
+      <w:r>
+        <w:rPr>
+          <w:sz w:val="22"/>
+          <w:szCs w:val="22"/>
+          <w:lang w:val="sv-SE"/>
+        </w:rPr>
+        <w:t xml:space="preserve"> för </w:t>
+      </w:r>
+      <w:proofErr w:type="spellStart"/>
+      <w:r>
+        <w:rPr>
+          <w:sz w:val="22"/>
+          <w:szCs w:val="22"/>
+          <w:lang w:val="sv-SE"/>
+        </w:rPr>
+        <w:t>datan</w:t>
+      </w:r>
+      <w:proofErr w:type="spellEnd"/>
+      <w:r>
+        <w:rPr>
+          <w:sz w:val="22"/>
+          <w:szCs w:val="22"/>
+          <w:lang w:val="sv-SE"/>
+        </w:rPr>
+        <w:t xml:space="preserve"> vi vet vilket resulterar i att den blir dålig på </w:t>
+      </w:r>
+      <w:proofErr w:type="gramStart"/>
+      <w:r>
+        <w:rPr>
+          <w:sz w:val="22"/>
+          <w:szCs w:val="22"/>
+          <w:lang w:val="sv-SE"/>
+        </w:rPr>
+        <w:t>ny osedd data</w:t>
+      </w:r>
+      <w:proofErr w:type="gramEnd"/>
+      <w:r>
+        <w:rPr>
+          <w:sz w:val="22"/>
+          <w:szCs w:val="22"/>
+          <w:lang w:val="sv-SE"/>
+        </w:rPr>
+        <w:t xml:space="preserve">. </w:t>
+      </w:r>
+      <w:r>
+        <w:rPr>
+          <w:sz w:val="22"/>
+          <w:szCs w:val="22"/>
+          <w:lang w:val="sv-SE"/>
+        </w:rPr>
+        <w:br/>
+      </w:r>
+      <w:proofErr w:type="gramStart"/>
+      <w:r>
+        <w:rPr>
+          <w:sz w:val="22"/>
+          <w:szCs w:val="22"/>
+          <w:lang w:val="sv-SE"/>
+        </w:rPr>
+        <w:t>Medans</w:t>
+      </w:r>
+      <w:proofErr w:type="gramEnd"/>
+      <w:r>
+        <w:rPr>
+          <w:sz w:val="22"/>
+          <w:szCs w:val="22"/>
+          <w:lang w:val="sv-SE"/>
+        </w:rPr>
+        <w:t xml:space="preserve"> </w:t>
+      </w:r>
+      <w:proofErr w:type="spellStart"/>
+      <w:r>
+        <w:rPr>
+          <w:sz w:val="22"/>
+          <w:szCs w:val="22"/>
+          <w:lang w:val="sv-SE"/>
+        </w:rPr>
+        <w:t>underfiting</w:t>
+      </w:r>
+      <w:proofErr w:type="spellEnd"/>
+      <w:r>
+        <w:rPr>
+          <w:sz w:val="22"/>
+          <w:szCs w:val="22"/>
+          <w:lang w:val="sv-SE"/>
+        </w:rPr>
+        <w:t xml:space="preserve"> </w:t>
+      </w:r>
+      <w:r>
+        <w:rPr>
+          <w:sz w:val="22"/>
+          <w:szCs w:val="22"/>
+          <w:lang w:val="sv-SE"/>
+        </w:rPr>
+        <w:t xml:space="preserve">(underanpassad) </w:t>
+      </w:r>
+      <w:r>
+        <w:rPr>
+          <w:sz w:val="22"/>
+          <w:szCs w:val="22"/>
+          <w:lang w:val="sv-SE"/>
+        </w:rPr>
+        <w:t xml:space="preserve">är att modellen är för simpel så den tar inte upp </w:t>
+      </w:r>
+      <w:r>
+        <w:rPr>
+          <w:sz w:val="22"/>
+          <w:szCs w:val="22"/>
+          <w:lang w:val="sv-SE"/>
+        </w:rPr>
+        <w:t xml:space="preserve">alla tendenser i </w:t>
+      </w:r>
+      <w:proofErr w:type="spellStart"/>
+      <w:r>
+        <w:rPr>
+          <w:sz w:val="22"/>
+          <w:szCs w:val="22"/>
+          <w:lang w:val="sv-SE"/>
+        </w:rPr>
+        <w:t>datan</w:t>
+      </w:r>
+      <w:proofErr w:type="spellEnd"/>
+      <w:r>
+        <w:rPr>
+          <w:sz w:val="22"/>
+          <w:szCs w:val="22"/>
+          <w:lang w:val="sv-SE"/>
+        </w:rPr>
+        <w:t xml:space="preserve">. Tex att sätta en enkel linjär modell på en andragradskurva. Detta kan man bla se om man kollar på </w:t>
+      </w:r>
+      <w:proofErr w:type="spellStart"/>
+      <w:r>
+        <w:rPr>
+          <w:sz w:val="22"/>
+          <w:szCs w:val="22"/>
+          <w:lang w:val="sv-SE"/>
+        </w:rPr>
+        <w:t>residualer</w:t>
+      </w:r>
+      <w:proofErr w:type="spellEnd"/>
+      <w:r>
+        <w:rPr>
+          <w:sz w:val="22"/>
+          <w:szCs w:val="22"/>
+          <w:lang w:val="sv-SE"/>
+        </w:rPr>
+        <w:t xml:space="preserve"> och ser mönster i dom. De bör vara </w:t>
+      </w:r>
+      <w:proofErr w:type="spellStart"/>
+      <w:r>
+        <w:rPr>
+          <w:sz w:val="22"/>
+          <w:szCs w:val="22"/>
+          <w:lang w:val="sv-SE"/>
+        </w:rPr>
+        <w:t>utrsprida</w:t>
+      </w:r>
+      <w:proofErr w:type="spellEnd"/>
+      <w:r>
+        <w:rPr>
+          <w:sz w:val="22"/>
+          <w:szCs w:val="22"/>
+          <w:lang w:val="sv-SE"/>
+        </w:rPr>
+        <w:t xml:space="preserve"> lika mycket över som under 0 men om man ser att de tenderar att bli för höga eller för låga så kan man gissa på att man behöver justera modellen. Ett annat sätt är att kolla på antal </w:t>
+      </w:r>
+      <w:proofErr w:type="spellStart"/>
+      <w:r>
+        <w:rPr>
+          <w:sz w:val="22"/>
+          <w:szCs w:val="22"/>
+          <w:lang w:val="sv-SE"/>
+        </w:rPr>
+        <w:t>supportvectorer</w:t>
+      </w:r>
+      <w:proofErr w:type="spellEnd"/>
+      <w:r>
+        <w:rPr>
+          <w:sz w:val="22"/>
+          <w:szCs w:val="22"/>
+          <w:lang w:val="sv-SE"/>
+        </w:rPr>
+        <w:t xml:space="preserve"> i SVM modellerna, då om det är en stor andel så är modellen säkerligen överanpassad och om det är väldigt lågt antal är den högst troligen underanpassad.</w:t>
+      </w:r>
     </w:p>
     <w:sectPr>
       <w:pgSz w:w="11906" w:h="16838"/>
@@ -1710,7 +3328,6 @@
   <w:style w:type="character" w:default="1" w:styleId="Standardstycketeckensnitt">
     <w:name w:val="Default Paragraph Font"/>
     <w:uiPriority w:val="1"/>
-    <w:semiHidden/>
     <w:unhideWhenUsed/>
   </w:style>
   <w:style w:type="table" w:default="1" w:styleId="Normaltabell">
@@ -2340,4 +3957,16 @@
     </a:ext>
   </a:extLst>
 </a:theme>
+</file>
+
+<file path=customXml/item1.xml><?xml version="1.0" encoding="utf-8"?>
+<b:Sources xmlns:b="http://schemas.openxmlformats.org/officeDocument/2006/bibliography" xmlns="http://schemas.openxmlformats.org/officeDocument/2006/bibliography" SelectedStyle="\APASixthEditionOfficeOnline.xsl" StyleName="APA" Version="6"/>
+</file>
+
+<file path=customXml/itemProps1.xml><?xml version="1.0" encoding="utf-8"?>
+<ds:datastoreItem xmlns:ds="http://schemas.openxmlformats.org/officeDocument/2006/customXml" ds:itemID="{0A77F616-D9E2-4AAE-9B3E-8B2B5B56CC7F}">
+  <ds:schemaRefs>
+    <ds:schemaRef ds:uri="http://schemas.openxmlformats.org/officeDocument/2006/bibliography"/>
+  </ds:schemaRefs>
+</ds:datastoreItem>
 </file>
</xml_diff>